<commit_message>
Add diagrams and application screenshots to report
Co-authored-by: arena-agent <297053741+arena-agent@users.noreply.github.com>
</commit_message>
<xml_diff>
--- a/docs/Macrova_BCA_Project_Report.docx
+++ b/docs/Macrova_BCA_Project_Report.docx
@@ -519,6 +519,8 @@
       </w:pPr>
       <w:r>
         <w:t>Appendix B: Calculations, Test Record and Operations  78–81</w:t>
+        <w:br/>
+        <w:t>Appendix C: Diagrams and Application Screenshots  82–93</w:t>
       </w:r>
     </w:p>
     <w:p>
@@ -540,7 +542,7 @@
         <w:jc w:val="both"/>
       </w:pPr>
       <w:r>
-        <w:t>Figures / textual design summaries: 4.1 Macrova high-level architecture; 4.2 request and token flow; 4.5 conceptual data relationships. Additional lifecycle, API, and calculation flows are documented in the relevant chapter sections.</w:t>
+        <w:t>Figures C.1–C.5: architecture; authentication sequence; domain model; nutrition calculation pipeline; AI suggestion sequence. Screenshots C.1–C.6: registration, sign-in, dashboard, daily tracking, food suggestions, and plan form.</w:t>
       </w:r>
     </w:p>
     <w:p>
@@ -3366,6 +3368,749 @@
       </w:pPr>
       <w:r>
         <w:t>8. Start services in a non-production environment and verify login, protected API, plan creation, tracking, and AI-provider failure handling. 9. Add database indexes and backups. 10. Review logs for secret redaction and define retention. 11. Perform security and privacy review before production. Exact deployment commands and values are environment-specific and should never include real secrets in this report.</w:t>
+      </w:r>
+    </w:p>
+    <w:p>
+      <w:r>
+        <w:br w:type="page"/>
+      </w:r>
+    </w:p>
+    <w:p>
+      <w:pPr>
+        <w:pStyle w:val="Heading1"/>
+        <w:spacing w:after="240"/>
+      </w:pPr>
+      <w:r>
+        <w:t>APPENDIX C — DIAGRAMS AND APPLICATION SCREENSHOTS</w:t>
+      </w:r>
+    </w:p>
+    <w:p>
+      <w:pPr>
+        <w:jc w:val="both"/>
+      </w:pPr>
+      <w:r>
+        <w:t>This appendix adds rendered design diagrams and captures of the current Macrova Angular interface. The five diagrams are original documentation figures derived from the repository architecture and flows. The six UI images were captured from the application running locally. Authenticated screenshots use synthetic, mocked API fixtures solely to render the screens; they do not show real users, a production database, or live external-model output.</w:t>
+      </w:r>
+    </w:p>
+    <w:p>
+      <w:r>
+        <w:br w:type="page"/>
+      </w:r>
+    </w:p>
+    <w:p>
+      <w:pPr>
+        <w:pStyle w:val="Heading1"/>
+        <w:spacing w:after="160"/>
+      </w:pPr>
+      <w:r>
+        <w:t>Figure C.1 — Macrova logical system architecture</w:t>
+      </w:r>
+    </w:p>
+    <w:p>
+      <w:pPr>
+        <w:jc w:val="center"/>
+      </w:pPr>
+      <w:r>
+        <w:drawing>
+          <wp:inline xmlns:a="http://schemas.openxmlformats.org/drawingml/2006/main" xmlns:pic="http://schemas.openxmlformats.org/drawingml/2006/picture">
+            <wp:extent cx="5989320" cy="3636372"/>
+            <wp:docPr id="1" name="Picture 1"/>
+            <wp:cNvGraphicFramePr>
+              <a:graphicFrameLocks noChangeAspect="1"/>
+            </wp:cNvGraphicFramePr>
+            <a:graphic>
+              <a:graphicData uri="http://schemas.openxmlformats.org/drawingml/2006/picture">
+                <pic:pic>
+                  <pic:nvPicPr>
+                    <pic:cNvPr id="0" name="architecture.png"/>
+                    <pic:cNvPicPr/>
+                  </pic:nvPicPr>
+                  <pic:blipFill>
+                    <a:blip r:embed="rId11"/>
+                    <a:stretch>
+                      <a:fillRect/>
+                    </a:stretch>
+                  </pic:blipFill>
+                  <pic:spPr>
+                    <a:xfrm>
+                      <a:off x="0" y="0"/>
+                      <a:ext cx="5989320" cy="3636372"/>
+                    </a:xfrm>
+                    <a:prstGeom prst="rect"/>
+                  </pic:spPr>
+                </pic:pic>
+              </a:graphicData>
+            </a:graphic>
+          </wp:inline>
+        </w:drawing>
+      </w:r>
+    </w:p>
+    <w:p>
+      <w:pPr>
+        <w:spacing w:before="160" w:after="80"/>
+        <w:jc w:val="both"/>
+      </w:pPr>
+      <w:r>
+        <w:t>The diagram shows the Angular browser client, Spring Boot service layer, MongoDB persistence, and the external OpenRouter dependency used for meal suggestions.</w:t>
+      </w:r>
+    </w:p>
+    <w:p>
+      <w:r>
+        <w:br w:type="page"/>
+      </w:r>
+    </w:p>
+    <w:p>
+      <w:pPr>
+        <w:pStyle w:val="Heading1"/>
+        <w:spacing w:after="160"/>
+      </w:pPr>
+      <w:r>
+        <w:t>Figure C.2 — JWT login and refresh sequence</w:t>
+      </w:r>
+    </w:p>
+    <w:p>
+      <w:pPr>
+        <w:jc w:val="center"/>
+      </w:pPr>
+      <w:r>
+        <w:drawing>
+          <wp:inline xmlns:a="http://schemas.openxmlformats.org/drawingml/2006/main" xmlns:pic="http://schemas.openxmlformats.org/drawingml/2006/picture">
+            <wp:extent cx="5989320" cy="3636372"/>
+            <wp:docPr id="2" name="Picture 2"/>
+            <wp:cNvGraphicFramePr>
+              <a:graphicFrameLocks noChangeAspect="1"/>
+            </wp:cNvGraphicFramePr>
+            <a:graphic>
+              <a:graphicData uri="http://schemas.openxmlformats.org/drawingml/2006/picture">
+                <pic:pic>
+                  <pic:nvPicPr>
+                    <pic:cNvPr id="0" name="auth-flow.png"/>
+                    <pic:cNvPicPr/>
+                  </pic:nvPicPr>
+                  <pic:blipFill>
+                    <a:blip r:embed="rId12"/>
+                    <a:stretch>
+                      <a:fillRect/>
+                    </a:stretch>
+                  </pic:blipFill>
+                  <pic:spPr>
+                    <a:xfrm>
+                      <a:off x="0" y="0"/>
+                      <a:ext cx="5989320" cy="3636372"/>
+                    </a:xfrm>
+                    <a:prstGeom prst="rect"/>
+                  </pic:spPr>
+                </pic:pic>
+              </a:graphicData>
+            </a:graphic>
+          </wp:inline>
+        </w:drawing>
+      </w:r>
+    </w:p>
+    <w:p>
+      <w:pPr>
+        <w:spacing w:before="160" w:after="80"/>
+        <w:jc w:val="both"/>
+      </w:pPr>
+      <w:r>
+        <w:t>The sequence summarizes the credential authentication, refresh-cookie, and access-token lifecycle present in the source. Deployment security settings must be reviewed separately.</w:t>
+      </w:r>
+    </w:p>
+    <w:p>
+      <w:r>
+        <w:br w:type="page"/>
+      </w:r>
+    </w:p>
+    <w:p>
+      <w:pPr>
+        <w:pStyle w:val="Heading1"/>
+        <w:spacing w:after="160"/>
+      </w:pPr>
+      <w:r>
+        <w:t>Figure C.3 — Conceptual MongoDB document relationships</w:t>
+      </w:r>
+    </w:p>
+    <w:p>
+      <w:pPr>
+        <w:jc w:val="center"/>
+      </w:pPr>
+      <w:r>
+        <w:drawing>
+          <wp:inline xmlns:a="http://schemas.openxmlformats.org/drawingml/2006/main" xmlns:pic="http://schemas.openxmlformats.org/drawingml/2006/picture">
+            <wp:extent cx="5989320" cy="3636372"/>
+            <wp:docPr id="3" name="Picture 3"/>
+            <wp:cNvGraphicFramePr>
+              <a:graphicFrameLocks noChangeAspect="1"/>
+            </wp:cNvGraphicFramePr>
+            <a:graphic>
+              <a:graphicData uri="http://schemas.openxmlformats.org/drawingml/2006/picture">
+                <pic:pic>
+                  <pic:nvPicPr>
+                    <pic:cNvPr id="0" name="domain-model.png"/>
+                    <pic:cNvPicPr/>
+                  </pic:nvPicPr>
+                  <pic:blipFill>
+                    <a:blip r:embed="rId13"/>
+                    <a:stretch>
+                      <a:fillRect/>
+                    </a:stretch>
+                  </pic:blipFill>
+                  <pic:spPr>
+                    <a:xfrm>
+                      <a:off x="0" y="0"/>
+                      <a:ext cx="5989320" cy="3636372"/>
+                    </a:xfrm>
+                    <a:prstGeom prst="rect"/>
+                  </pic:spPr>
+                </pic:pic>
+              </a:graphicData>
+            </a:graphic>
+          </wp:inline>
+        </w:drawing>
+      </w:r>
+    </w:p>
+    <w:p>
+      <w:pPr>
+        <w:spacing w:before="160" w:after="80"/>
+        <w:jc w:val="both"/>
+      </w:pPr>
+      <w:r>
+        <w:t>User, diet-plan, tracking, and food-suggestion documents are stored in separate MongoDB collections; identifier links are application-level references.</w:t>
+      </w:r>
+    </w:p>
+    <w:p>
+      <w:r>
+        <w:br w:type="page"/>
+      </w:r>
+    </w:p>
+    <w:p>
+      <w:pPr>
+        <w:pStyle w:val="Heading1"/>
+        <w:spacing w:after="160"/>
+      </w:pPr>
+      <w:r>
+        <w:t>Figure C.4 — Energy and macronutrient calculation pipeline</w:t>
+      </w:r>
+    </w:p>
+    <w:p>
+      <w:pPr>
+        <w:jc w:val="center"/>
+      </w:pPr>
+      <w:r>
+        <w:drawing>
+          <wp:inline xmlns:a="http://schemas.openxmlformats.org/drawingml/2006/main" xmlns:pic="http://schemas.openxmlformats.org/drawingml/2006/picture">
+            <wp:extent cx="5989320" cy="3636372"/>
+            <wp:docPr id="4" name="Picture 4"/>
+            <wp:cNvGraphicFramePr>
+              <a:graphicFrameLocks noChangeAspect="1"/>
+            </wp:cNvGraphicFramePr>
+            <a:graphic>
+              <a:graphicData uri="http://schemas.openxmlformats.org/drawingml/2006/picture">
+                <pic:pic>
+                  <pic:nvPicPr>
+                    <pic:cNvPr id="0" name="calculation-flow.png"/>
+                    <pic:cNvPicPr/>
+                  </pic:nvPicPr>
+                  <pic:blipFill>
+                    <a:blip r:embed="rId14"/>
+                    <a:stretch>
+                      <a:fillRect/>
+                    </a:stretch>
+                  </pic:blipFill>
+                  <pic:spPr>
+                    <a:xfrm>
+                      <a:off x="0" y="0"/>
+                      <a:ext cx="5989320" cy="3636372"/>
+                    </a:xfrm>
+                    <a:prstGeom prst="rect"/>
+                  </pic:spPr>
+                </pic:pic>
+              </a:graphicData>
+            </a:graphic>
+          </wp:inline>
+        </w:drawing>
+      </w:r>
+    </w:p>
+    <w:p>
+      <w:pPr>
+        <w:spacing w:before="160" w:after="80"/>
+        <w:jc w:val="both"/>
+      </w:pPr>
+      <w:r>
+        <w:t>The flow summarizes the coded BMR/TDEE, goal adjustment, macro allocation, and meal split. Estimates are educational and not medical advice.</w:t>
+      </w:r>
+    </w:p>
+    <w:p>
+      <w:r>
+        <w:br w:type="page"/>
+      </w:r>
+    </w:p>
+    <w:p>
+      <w:pPr>
+        <w:pStyle w:val="Heading1"/>
+        <w:spacing w:after="160"/>
+      </w:pPr>
+      <w:r>
+        <w:t>Figure C.5 — AI meal suggestion request sequence</w:t>
+      </w:r>
+    </w:p>
+    <w:p>
+      <w:pPr>
+        <w:jc w:val="center"/>
+      </w:pPr>
+      <w:r>
+        <w:drawing>
+          <wp:inline xmlns:a="http://schemas.openxmlformats.org/drawingml/2006/main" xmlns:pic="http://schemas.openxmlformats.org/drawingml/2006/picture">
+            <wp:extent cx="5989320" cy="3636372"/>
+            <wp:docPr id="5" name="Picture 5"/>
+            <wp:cNvGraphicFramePr>
+              <a:graphicFrameLocks noChangeAspect="1"/>
+            </wp:cNvGraphicFramePr>
+            <a:graphic>
+              <a:graphicData uri="http://schemas.openxmlformats.org/drawingml/2006/picture">
+                <pic:pic>
+                  <pic:nvPicPr>
+                    <pic:cNvPr id="0" name="ai-sequence.png"/>
+                    <pic:cNvPicPr/>
+                  </pic:nvPicPr>
+                  <pic:blipFill>
+                    <a:blip r:embed="rId15"/>
+                    <a:stretch>
+                      <a:fillRect/>
+                    </a:stretch>
+                  </pic:blipFill>
+                  <pic:spPr>
+                    <a:xfrm>
+                      <a:off x="0" y="0"/>
+                      <a:ext cx="5989320" cy="3636372"/>
+                    </a:xfrm>
+                    <a:prstGeom prst="rect"/>
+                  </pic:spPr>
+                </pic:pic>
+              </a:graphicData>
+            </a:graphic>
+          </wp:inline>
+        </w:drawing>
+      </w:r>
+    </w:p>
+    <w:p>
+      <w:pPr>
+        <w:spacing w:before="160" w:after="80"/>
+        <w:jc w:val="both"/>
+      </w:pPr>
+      <w:r>
+        <w:t>The flow depicts filter submission, meal-calorie lookup, prompt construction, OpenRouter call, and JSON parsing. Generated nutrition is not independently food-database verified in the current code.</w:t>
+      </w:r>
+    </w:p>
+    <w:p>
+      <w:r>
+        <w:br w:type="page"/>
+      </w:r>
+    </w:p>
+    <w:p>
+      <w:pPr>
+        <w:pStyle w:val="Heading1"/>
+        <w:spacing w:after="160"/>
+      </w:pPr>
+      <w:r>
+        <w:t>Screenshot C.1 — Macrova account registration</w:t>
+      </w:r>
+    </w:p>
+    <w:p>
+      <w:pPr>
+        <w:jc w:val="center"/>
+      </w:pPr>
+      <w:r>
+        <w:drawing>
+          <wp:inline xmlns:a="http://schemas.openxmlformats.org/drawingml/2006/main" xmlns:pic="http://schemas.openxmlformats.org/drawingml/2006/picture">
+            <wp:extent cx="5989320" cy="4429601"/>
+            <wp:docPr id="6" name="Picture 6"/>
+            <wp:cNvGraphicFramePr>
+              <a:graphicFrameLocks noChangeAspect="1"/>
+            </wp:cNvGraphicFramePr>
+            <a:graphic>
+              <a:graphicData uri="http://schemas.openxmlformats.org/drawingml/2006/picture">
+                <pic:pic>
+                  <pic:nvPicPr>
+                    <pic:cNvPr id="0" name="signup.png"/>
+                    <pic:cNvPicPr/>
+                  </pic:nvPicPr>
+                  <pic:blipFill>
+                    <a:blip r:embed="rId16"/>
+                    <a:stretch>
+                      <a:fillRect/>
+                    </a:stretch>
+                  </pic:blipFill>
+                  <pic:spPr>
+                    <a:xfrm>
+                      <a:off x="0" y="0"/>
+                      <a:ext cx="5989320" cy="4429601"/>
+                    </a:xfrm>
+                    <a:prstGeom prst="rect"/>
+                  </pic:spPr>
+                </pic:pic>
+              </a:graphicData>
+            </a:graphic>
+          </wp:inline>
+        </w:drawing>
+      </w:r>
+    </w:p>
+    <w:p>
+      <w:pPr>
+        <w:spacing w:before="160" w:after="80"/>
+        <w:jc w:val="both"/>
+      </w:pPr>
+      <w:r>
+        <w:t>Captured from the running Angular application at /signup. The page was rendered locally; no real account information is shown.</w:t>
+      </w:r>
+    </w:p>
+    <w:p>
+      <w:r>
+        <w:br w:type="page"/>
+      </w:r>
+    </w:p>
+    <w:p>
+      <w:pPr>
+        <w:pStyle w:val="Heading1"/>
+        <w:spacing w:after="160"/>
+      </w:pPr>
+      <w:r>
+        <w:t>Screenshot C.2 — Macrova sign-in</w:t>
+      </w:r>
+    </w:p>
+    <w:p>
+      <w:pPr>
+        <w:jc w:val="center"/>
+      </w:pPr>
+      <w:r>
+        <w:drawing>
+          <wp:inline xmlns:a="http://schemas.openxmlformats.org/drawingml/2006/main" xmlns:pic="http://schemas.openxmlformats.org/drawingml/2006/picture">
+            <wp:extent cx="5989320" cy="4429601"/>
+            <wp:docPr id="7" name="Picture 7"/>
+            <wp:cNvGraphicFramePr>
+              <a:graphicFrameLocks noChangeAspect="1"/>
+            </wp:cNvGraphicFramePr>
+            <a:graphic>
+              <a:graphicData uri="http://schemas.openxmlformats.org/drawingml/2006/picture">
+                <pic:pic>
+                  <pic:nvPicPr>
+                    <pic:cNvPr id="0" name="login.png"/>
+                    <pic:cNvPicPr/>
+                  </pic:nvPicPr>
+                  <pic:blipFill>
+                    <a:blip r:embed="rId17"/>
+                    <a:stretch>
+                      <a:fillRect/>
+                    </a:stretch>
+                  </pic:blipFill>
+                  <pic:spPr>
+                    <a:xfrm>
+                      <a:off x="0" y="0"/>
+                      <a:ext cx="5989320" cy="4429601"/>
+                    </a:xfrm>
+                    <a:prstGeom prst="rect"/>
+                  </pic:spPr>
+                </pic:pic>
+              </a:graphicData>
+            </a:graphic>
+          </wp:inline>
+        </w:drawing>
+      </w:r>
+    </w:p>
+    <w:p>
+      <w:pPr>
+        <w:spacing w:before="160" w:after="80"/>
+        <w:jc w:val="both"/>
+      </w:pPr>
+      <w:r>
+        <w:t>Captured from the running Angular application at /login. The page was rendered locally; no credentials were entered.</w:t>
+      </w:r>
+    </w:p>
+    <w:p>
+      <w:r>
+        <w:br w:type="page"/>
+      </w:r>
+    </w:p>
+    <w:p>
+      <w:pPr>
+        <w:pStyle w:val="Heading1"/>
+        <w:spacing w:after="160"/>
+      </w:pPr>
+      <w:r>
+        <w:t>Screenshot C.3 — Dashboard and weight trend</w:t>
+      </w:r>
+    </w:p>
+    <w:p>
+      <w:pPr>
+        <w:jc w:val="center"/>
+      </w:pPr>
+      <w:r>
+        <w:drawing>
+          <wp:inline xmlns:a="http://schemas.openxmlformats.org/drawingml/2006/main" xmlns:pic="http://schemas.openxmlformats.org/drawingml/2006/picture">
+            <wp:extent cx="5989320" cy="4159249"/>
+            <wp:docPr id="8" name="Picture 8"/>
+            <wp:cNvGraphicFramePr>
+              <a:graphicFrameLocks noChangeAspect="1"/>
+            </wp:cNvGraphicFramePr>
+            <a:graphic>
+              <a:graphicData uri="http://schemas.openxmlformats.org/drawingml/2006/picture">
+                <pic:pic>
+                  <pic:nvPicPr>
+                    <pic:cNvPr id="0" name="dashboard.png"/>
+                    <pic:cNvPicPr/>
+                  </pic:nvPicPr>
+                  <pic:blipFill>
+                    <a:blip r:embed="rId18"/>
+                    <a:stretch>
+                      <a:fillRect/>
+                    </a:stretch>
+                  </pic:blipFill>
+                  <pic:spPr>
+                    <a:xfrm>
+                      <a:off x="0" y="0"/>
+                      <a:ext cx="5989320" cy="4159249"/>
+                    </a:xfrm>
+                    <a:prstGeom prst="rect"/>
+                  </pic:spPr>
+                </pic:pic>
+              </a:graphicData>
+            </a:graphic>
+          </wp:inline>
+        </w:drawing>
+      </w:r>
+    </w:p>
+    <w:p>
+      <w:pPr>
+        <w:spacing w:before="160" w:after="80"/>
+        <w:jc w:val="both"/>
+      </w:pPr>
+      <w:r>
+        <w:t>Captured from the running Angular application at /dashboard. Demonstration-only API fixtures provide synthetic progress values; this is not a live account or production database screenshot.</w:t>
+      </w:r>
+    </w:p>
+    <w:p>
+      <w:pPr>
+        <w:jc w:val="center"/>
+      </w:pPr>
+      <w:r>
+        <w:rPr>
+          <w:i/>
+          <w:color w:val="5A696E"/>
+          <w:sz w:val="18"/>
+        </w:rPr>
+        <w:t>Capture note: local development frontend with mocked API response data; values are illustrative only.</w:t>
+      </w:r>
+    </w:p>
+    <w:p>
+      <w:r>
+        <w:br w:type="page"/>
+      </w:r>
+    </w:p>
+    <w:p>
+      <w:pPr>
+        <w:pStyle w:val="Heading1"/>
+        <w:spacing w:after="160"/>
+      </w:pPr>
+      <w:r>
+        <w:t>Screenshot C.4 — Daily macronutrient log</w:t>
+      </w:r>
+    </w:p>
+    <w:p>
+      <w:pPr>
+        <w:jc w:val="center"/>
+      </w:pPr>
+      <w:r>
+        <w:drawing>
+          <wp:inline xmlns:a="http://schemas.openxmlformats.org/drawingml/2006/main" xmlns:pic="http://schemas.openxmlformats.org/drawingml/2006/picture">
+            <wp:extent cx="5284081" cy="5074920"/>
+            <wp:docPr id="9" name="Picture 9"/>
+            <wp:cNvGraphicFramePr>
+              <a:graphicFrameLocks noChangeAspect="1"/>
+            </wp:cNvGraphicFramePr>
+            <a:graphic>
+              <a:graphicData uri="http://schemas.openxmlformats.org/drawingml/2006/picture">
+                <pic:pic>
+                  <pic:nvPicPr>
+                    <pic:cNvPr id="0" name="progress.png"/>
+                    <pic:cNvPicPr/>
+                  </pic:nvPicPr>
+                  <pic:blipFill>
+                    <a:blip r:embed="rId19"/>
+                    <a:stretch>
+                      <a:fillRect/>
+                    </a:stretch>
+                  </pic:blipFill>
+                  <pic:spPr>
+                    <a:xfrm>
+                      <a:off x="0" y="0"/>
+                      <a:ext cx="5284081" cy="5074920"/>
+                    </a:xfrm>
+                    <a:prstGeom prst="rect"/>
+                  </pic:spPr>
+                </pic:pic>
+              </a:graphicData>
+            </a:graphic>
+          </wp:inline>
+        </w:drawing>
+      </w:r>
+    </w:p>
+    <w:p>
+      <w:pPr>
+        <w:spacing w:before="160" w:after="80"/>
+        <w:jc w:val="both"/>
+      </w:pPr>
+      <w:r>
+        <w:t>Captured from the running Angular application at /progress. Synthetic demo API values are used for the displayed weight and targets; no personal data is present.</w:t>
+      </w:r>
+    </w:p>
+    <w:p>
+      <w:pPr>
+        <w:jc w:val="center"/>
+      </w:pPr>
+      <w:r>
+        <w:rPr>
+          <w:i/>
+          <w:color w:val="5A696E"/>
+          <w:sz w:val="18"/>
+        </w:rPr>
+        <w:t>Capture note: local development frontend with mocked API response data; values are illustrative only.</w:t>
+      </w:r>
+    </w:p>
+    <w:p>
+      <w:r>
+        <w:br w:type="page"/>
+      </w:r>
+    </w:p>
+    <w:p>
+      <w:pPr>
+        <w:pStyle w:val="Heading1"/>
+        <w:spacing w:after="160"/>
+      </w:pPr>
+      <w:r>
+        <w:t>Screenshot C.5 — AI food suggestion filters and sample results</w:t>
+      </w:r>
+    </w:p>
+    <w:p>
+      <w:pPr>
+        <w:jc w:val="center"/>
+      </w:pPr>
+      <w:r>
+        <w:drawing>
+          <wp:inline xmlns:a="http://schemas.openxmlformats.org/drawingml/2006/main" xmlns:pic="http://schemas.openxmlformats.org/drawingml/2006/picture">
+            <wp:extent cx="5989320" cy="4159249"/>
+            <wp:docPr id="10" name="Picture 10"/>
+            <wp:cNvGraphicFramePr>
+              <a:graphicFrameLocks noChangeAspect="1"/>
+            </wp:cNvGraphicFramePr>
+            <a:graphic>
+              <a:graphicData uri="http://schemas.openxmlformats.org/drawingml/2006/picture">
+                <pic:pic>
+                  <pic:nvPicPr>
+                    <pic:cNvPr id="0" name="meal-suggestions.png"/>
+                    <pic:cNvPicPr/>
+                  </pic:nvPicPr>
+                  <pic:blipFill>
+                    <a:blip r:embed="rId20"/>
+                    <a:stretch>
+                      <a:fillRect/>
+                    </a:stretch>
+                  </pic:blipFill>
+                  <pic:spPr>
+                    <a:xfrm>
+                      <a:off x="0" y="0"/>
+                      <a:ext cx="5989320" cy="4159249"/>
+                    </a:xfrm>
+                    <a:prstGeom prst="rect"/>
+                  </pic:spPr>
+                </pic:pic>
+              </a:graphicData>
+            </a:graphic>
+          </wp:inline>
+        </w:drawing>
+      </w:r>
+    </w:p>
+    <w:p>
+      <w:pPr>
+        <w:spacing w:before="160" w:after="80"/>
+        <w:jc w:val="both"/>
+      </w:pPr>
+      <w:r>
+        <w:t>Captured from the running Angular application at /meals. The UI is live; sample suggestion results are mocked for documentation and were not generated by the external model during capture.</w:t>
+      </w:r>
+    </w:p>
+    <w:p>
+      <w:pPr>
+        <w:jc w:val="center"/>
+      </w:pPr>
+      <w:r>
+        <w:rPr>
+          <w:i/>
+          <w:color w:val="5A696E"/>
+          <w:sz w:val="18"/>
+        </w:rPr>
+        <w:t>Capture note: local development frontend with mocked API response data; values are illustrative only.</w:t>
+      </w:r>
+    </w:p>
+    <w:p>
+      <w:r>
+        <w:br w:type="page"/>
+      </w:r>
+    </w:p>
+    <w:p>
+      <w:pPr>
+        <w:pStyle w:val="Heading1"/>
+        <w:spacing w:after="160"/>
+      </w:pPr>
+      <w:r>
+        <w:t>Screenshot C.6 — Diet-plan creation form</w:t>
+      </w:r>
+    </w:p>
+    <w:p>
+      <w:pPr>
+        <w:jc w:val="center"/>
+      </w:pPr>
+      <w:r>
+        <w:drawing>
+          <wp:inline xmlns:a="http://schemas.openxmlformats.org/drawingml/2006/main" xmlns:pic="http://schemas.openxmlformats.org/drawingml/2006/picture">
+            <wp:extent cx="5989320" cy="4704111"/>
+            <wp:docPr id="11" name="Picture 11"/>
+            <wp:cNvGraphicFramePr>
+              <a:graphicFrameLocks noChangeAspect="1"/>
+            </wp:cNvGraphicFramePr>
+            <a:graphic>
+              <a:graphicData uri="http://schemas.openxmlformats.org/drawingml/2006/picture">
+                <pic:pic>
+                  <pic:nvPicPr>
+                    <pic:cNvPr id="0" name="plan-form.png"/>
+                    <pic:cNvPicPr/>
+                  </pic:nvPicPr>
+                  <pic:blipFill>
+                    <a:blip r:embed="rId21"/>
+                    <a:stretch>
+                      <a:fillRect/>
+                    </a:stretch>
+                  </pic:blipFill>
+                  <pic:spPr>
+                    <a:xfrm>
+                      <a:off x="0" y="0"/>
+                      <a:ext cx="5989320" cy="4704111"/>
+                    </a:xfrm>
+                    <a:prstGeom prst="rect"/>
+                  </pic:spPr>
+                </pic:pic>
+              </a:graphicData>
+            </a:graphic>
+          </wp:inline>
+        </w:drawing>
+      </w:r>
+    </w:p>
+    <w:p>
+      <w:pPr>
+        <w:spacing w:before="160" w:after="80"/>
+        <w:jc w:val="both"/>
+      </w:pPr>
+      <w:r>
+        <w:t>Captured from the running Angular application at /diet-plan-form. The form is shown in its initial state; no submission was made.</w:t>
       </w:r>
     </w:p>
     <w:sectPr>

</xml_diff>

<commit_message>
Improve report visual appendix visibility
Co-authored-by: arena-agent <297053741+arena-agent@users.noreply.github.com>
</commit_message>
<xml_diff>
--- a/docs/Macrova_BCA_Project_Report.docx
+++ b/docs/Macrova_BCA_Project_Report.docx
@@ -3723,7 +3723,7 @@
       <w:r>
         <w:drawing>
           <wp:inline xmlns:a="http://schemas.openxmlformats.org/drawingml/2006/main" xmlns:pic="http://schemas.openxmlformats.org/drawingml/2006/picture">
-            <wp:extent cx="5989320" cy="4429601"/>
+            <wp:extent cx="5501782" cy="5074920"/>
             <wp:docPr id="6" name="Picture 6"/>
             <wp:cNvGraphicFramePr>
               <a:graphicFrameLocks noChangeAspect="1"/>
@@ -3744,7 +3744,7 @@
                   <pic:spPr>
                     <a:xfrm>
                       <a:off x="0" y="0"/>
-                      <a:ext cx="5989320" cy="4429601"/>
+                      <a:ext cx="5501782" cy="5074920"/>
                     </a:xfrm>
                     <a:prstGeom prst="rect"/>
                   </pic:spPr>
@@ -3785,7 +3785,7 @@
       <w:r>
         <w:drawing>
           <wp:inline xmlns:a="http://schemas.openxmlformats.org/drawingml/2006/main" xmlns:pic="http://schemas.openxmlformats.org/drawingml/2006/picture">
-            <wp:extent cx="5989320" cy="4429601"/>
+            <wp:extent cx="5989320" cy="4646886"/>
             <wp:docPr id="7" name="Picture 7"/>
             <wp:cNvGraphicFramePr>
               <a:graphicFrameLocks noChangeAspect="1"/>
@@ -3806,7 +3806,7 @@
                   <pic:spPr>
                     <a:xfrm>
                       <a:off x="0" y="0"/>
-                      <a:ext cx="5989320" cy="4429601"/>
+                      <a:ext cx="5989320" cy="4646886"/>
                     </a:xfrm>
                     <a:prstGeom prst="rect"/>
                   </pic:spPr>
@@ -3847,7 +3847,7 @@
       <w:r>
         <w:drawing>
           <wp:inline xmlns:a="http://schemas.openxmlformats.org/drawingml/2006/main" xmlns:pic="http://schemas.openxmlformats.org/drawingml/2006/picture">
-            <wp:extent cx="5989320" cy="4159249"/>
+            <wp:extent cx="5443489" cy="5074920"/>
             <wp:docPr id="8" name="Picture 8"/>
             <wp:cNvGraphicFramePr>
               <a:graphicFrameLocks noChangeAspect="1"/>
@@ -3868,7 +3868,7 @@
                   <pic:spPr>
                     <a:xfrm>
                       <a:off x="0" y="0"/>
-                      <a:ext cx="5989320" cy="4159249"/>
+                      <a:ext cx="5443489" cy="5074920"/>
                     </a:xfrm>
                     <a:prstGeom prst="rect"/>
                   </pic:spPr>
@@ -3922,7 +3922,7 @@
       <w:r>
         <w:drawing>
           <wp:inline xmlns:a="http://schemas.openxmlformats.org/drawingml/2006/main" xmlns:pic="http://schemas.openxmlformats.org/drawingml/2006/picture">
-            <wp:extent cx="5284081" cy="5074920"/>
+            <wp:extent cx="5632281" cy="5074920"/>
             <wp:docPr id="9" name="Picture 9"/>
             <wp:cNvGraphicFramePr>
               <a:graphicFrameLocks noChangeAspect="1"/>
@@ -3943,7 +3943,7 @@
                   <pic:spPr>
                     <a:xfrm>
                       <a:off x="0" y="0"/>
-                      <a:ext cx="5284081" cy="5074920"/>
+                      <a:ext cx="5632281" cy="5074920"/>
                     </a:xfrm>
                     <a:prstGeom prst="rect"/>
                   </pic:spPr>
@@ -3960,7 +3960,7 @@
         <w:jc w:val="both"/>
       </w:pPr>
       <w:r>
-        <w:t>Captured from the running Angular application at /progress. Synthetic demo API values are used for the displayed weight and targets; no personal data is present.</w:t>
+        <w:t>Captured from the running Angular application at /progress. The cropped view highlights the daily summary and breakfast/lunch macro-entry cards; synthetic demo API values are used, not personal data.</w:t>
       </w:r>
     </w:p>
     <w:p>
@@ -3997,7 +3997,7 @@
       <w:r>
         <w:drawing>
           <wp:inline xmlns:a="http://schemas.openxmlformats.org/drawingml/2006/main" xmlns:pic="http://schemas.openxmlformats.org/drawingml/2006/picture">
-            <wp:extent cx="5989320" cy="4159249"/>
+            <wp:extent cx="5443489" cy="5074920"/>
             <wp:docPr id="10" name="Picture 10"/>
             <wp:cNvGraphicFramePr>
               <a:graphicFrameLocks noChangeAspect="1"/>
@@ -4018,7 +4018,7 @@
                   <pic:spPr>
                     <a:xfrm>
                       <a:off x="0" y="0"/>
-                      <a:ext cx="5989320" cy="4159249"/>
+                      <a:ext cx="5443489" cy="5074920"/>
                     </a:xfrm>
                     <a:prstGeom prst="rect"/>
                   </pic:spPr>
@@ -4072,7 +4072,7 @@
       <w:r>
         <w:drawing>
           <wp:inline xmlns:a="http://schemas.openxmlformats.org/drawingml/2006/main" xmlns:pic="http://schemas.openxmlformats.org/drawingml/2006/picture">
-            <wp:extent cx="5989320" cy="4704111"/>
+            <wp:extent cx="3961833" cy="5074920"/>
             <wp:docPr id="11" name="Picture 11"/>
             <wp:cNvGraphicFramePr>
               <a:graphicFrameLocks noChangeAspect="1"/>
@@ -4093,7 +4093,7 @@
                   <pic:spPr>
                     <a:xfrm>
                       <a:off x="0" y="0"/>
-                      <a:ext cx="5989320" cy="4704111"/>
+                      <a:ext cx="3961833" cy="5074920"/>
                     </a:xfrm>
                     <a:prstGeom prst="rect"/>
                   </pic:spPr>

</xml_diff>